<commit_message>
Keep signature rows level when partially signed
Pin signature-line height and pad unsigned table cells so names in a signature row remain level. Adds EMU/TWIP constants, withFixedSignatureHeight(), spacerEditsForRowOf(), enclosingElement()/childElements()/indexOfElement() helpers, and refactors insertSignatures to compute placements and avoid double-padding. Moves Edit record to class scope. Adds unit tests covering padding/leveling scenarios and updates doc_2.docx. Also removes duplicate loading subtitle lines in esign_pdf_viewer.js.
</commit_message>
<xml_diff>
--- a/HRCP-KKU-Academic/src/main/resources/templates/docx/doc_2.docx
+++ b/HRCP-KKU-Academic/src/main/resources/templates/docx/doc_2.docx
@@ -1,10 +1,10 @@
 
 <file path=word/document.xml><?xml version="1.0" encoding="utf-8"?>
-<w:document xmlns:wpc="http://schemas.microsoft.com/office/word/2010/wordprocessingCanvas" xmlns:cx="http://schemas.microsoft.com/office/drawing/2014/chartex" xmlns:cx1="http://schemas.microsoft.com/office/drawing/2015/9/8/chartex" xmlns:cx2="http://schemas.microsoft.com/office/drawing/2015/10/21/chartex" xmlns:cx3="http://schemas.microsoft.com/office/drawing/2016/5/9/chartex" xmlns:cx4="http://schemas.microsoft.com/office/drawing/2016/5/10/chartex" xmlns:cx5="http://schemas.microsoft.com/office/drawing/2016/5/11/chartex" xmlns:cx6="http://schemas.microsoft.com/office/drawing/2016/5/12/chartex" xmlns:cx7="http://schemas.microsoft.com/office/drawing/2016/5/13/chartex" xmlns:cx8="http://schemas.microsoft.com/office/drawing/2016/5/14/chartex" xmlns:mc="http://schemas.openxmlformats.org/markup-compatibility/2006" xmlns:aink="http://schemas.microsoft.com/office/drawing/2016/ink" xmlns:am3d="http://schemas.microsoft.com/office/drawing/2017/model3d" xmlns:o="urn:schemas-microsoft-com:office:office" xmlns:oel="http://schemas.microsoft.com/office/2019/extlst" xmlns:r="http://schemas.openxmlformats.org/officeDocument/2006/relationships" xmlns:m="http://schemas.openxmlformats.org/officeDocument/2006/math" xmlns:v="urn:schemas-microsoft-com:vml" xmlns:wp14="http://schemas.microsoft.com/office/word/2010/wordprocessingDrawing" xmlns:wp="http://schemas.openxmlformats.org/drawingml/2006/wordprocessingDrawing" xmlns:w10="urn:schemas-microsoft-com:office:word" xmlns:w="http://schemas.openxmlformats.org/wordprocessingml/2006/main" xmlns:w14="http://schemas.microsoft.com/office/word/2010/wordml" xmlns:w15="http://schemas.microsoft.com/office/word/2012/wordml" xmlns:w16cex="http://schemas.microsoft.com/office/word/2018/wordml/cex" xmlns:w16cid="http://schemas.microsoft.com/office/word/2016/wordml/cid" xmlns:w16="http://schemas.microsoft.com/office/word/2018/wordml" xmlns:w16du="http://schemas.microsoft.com/office/word/2023/wordml/word16du" xmlns:w16sdtdh="http://schemas.microsoft.com/office/word/2020/wordml/sdtdatahash" xmlns:w16sdtfl="http://schemas.microsoft.com/office/word/2024/wordml/sdtformatlock" xmlns:w16se="http://schemas.microsoft.com/office/word/2015/wordml/symex" xmlns:wpg="http://schemas.microsoft.com/office/word/2010/wordprocessingGroup" xmlns:wpi="http://schemas.microsoft.com/office/word/2010/wordprocessingInk" xmlns:wne="http://schemas.microsoft.com/office/word/2006/wordml" xmlns:wps="http://schemas.microsoft.com/office/word/2010/wordprocessingShape" mc:Ignorable="w14 w15 w16se w16cid w16 w16cex w16sdtdh w16sdtfl w16du wp14">
+<w:document xmlns:wpc="http://schemas.microsoft.com/office/word/2010/wordprocessingCanvas" xmlns:cx="http://schemas.microsoft.com/office/drawing/2014/chartex" xmlns:cx1="http://schemas.microsoft.com/office/drawing/2015/9/8/chartex" xmlns:cx2="http://schemas.microsoft.com/office/drawing/2015/10/21/chartex" xmlns:cx3="http://schemas.microsoft.com/office/drawing/2016/5/9/chartex" xmlns:cx4="http://schemas.microsoft.com/office/drawing/2016/5/10/chartex" xmlns:cx5="http://schemas.microsoft.com/office/drawing/2016/5/11/chartex" xmlns:cx6="http://schemas.microsoft.com/office/drawing/2016/5/12/chartex" xmlns:cx7="http://schemas.microsoft.com/office/drawing/2016/5/13/chartex" xmlns:cx8="http://schemas.microsoft.com/office/drawing/2016/5/14/chartex" xmlns:mc="http://schemas.openxmlformats.org/markup-compatibility/2006" xmlns:m="http://schemas.openxmlformats.org/officeDocument/2006/math" xmlns:aink="http://schemas.microsoft.com/office/drawing/2016/ink" xmlns:am3d="http://schemas.microsoft.com/office/drawing/2017/model3d" xmlns:oel="http://schemas.microsoft.com/office/2019/extlst" xmlns:r="http://schemas.openxmlformats.org/officeDocument/2006/relationships" xmlns:wp14="http://schemas.microsoft.com/office/word/2010/wordprocessingDrawing" xmlns:wp="http://schemas.openxmlformats.org/drawingml/2006/wordprocessingDrawing" xmlns:wpg="http://schemas.microsoft.com/office/word/2010/wordprocessingGroup" xmlns:wpi="http://schemas.microsoft.com/office/word/2010/wordprocessingInk" xmlns:wps="http://schemas.microsoft.com/office/word/2010/wordprocessingShape" xmlns:o="urn:schemas-microsoft-com:office:office" xmlns:v="urn:schemas-microsoft-com:vml" xmlns:w10="urn:schemas-microsoft-com:office:word" xmlns:w="http://schemas.openxmlformats.org/wordprocessingml/2006/main" xmlns:w14="http://schemas.microsoft.com/office/word/2010/wordml" xmlns:w15="http://schemas.microsoft.com/office/word/2012/wordml" xmlns:w16cex="http://schemas.microsoft.com/office/word/2018/wordml/cex" xmlns:w16cid="http://schemas.microsoft.com/office/word/2016/wordml/cid" xmlns:w16="http://schemas.microsoft.com/office/word/2018/wordml" xmlns:w16sdtdh="http://schemas.microsoft.com/office/word/2020/wordml/sdtdatahash" xmlns:w16sdtfl="http://schemas.microsoft.com/office/word/2024/wordml/sdtformatlock" xmlns:w16se="http://schemas.microsoft.com/office/word/2015/wordml/symex" xmlns:w16du="http://schemas.microsoft.com/office/word/2023/wordml/word16du" xmlns:wne="http://schemas.microsoft.com/office/word/2006/wordml" mc:Ignorable="w14 w15 w16se w16cid w16 w16cex w16sdtdh w16sdtfl w16du wp14">
   <w:body>
     <w:tbl>
       <w:tblPr>
-        <w:tblStyle w:val="ae"/>
+        <w:tblStyle w:val="TableGrid"/>
         <w:tblW w:w="9990" w:type="dxa"/>
         <w:tblInd w:w="-185" w:type="dxa"/>
         <w:tblLook w:val="04A0" w:firstRow="1" w:lastRow="0" w:firstColumn="1" w:lastColumn="0" w:noHBand="0" w:noVBand="1"/>
@@ -295,6 +295,16 @@
                 <w:lang w:val="en-US" w:eastAsia="en-GB"/>
               </w:rPr>
             </w:pPr>
+            <w:r>
+              <w:rPr>
+                <w:rFonts w:ascii="TH Sarabun New" w:eastAsia="Times New Roman" w:hAnsi="TH Sarabun New" w:cs="TH Sarabun New" w:hint="cs"/>
+                <w:sz w:val="28"/>
+                <w:szCs w:val="28"/>
+                <w:cs/>
+                <w:lang w:val="en-US" w:eastAsia="en-GB"/>
+              </w:rPr>
+              <w:t xml:space="preserve">     </w:t>
+            </w:r>
             <w:r>
               <w:rPr>
                 <w:rFonts w:ascii="TH Sarabun New" w:eastAsia="Times New Roman" w:hAnsi="TH Sarabun New" w:cs="TH Sarabun New"/>
@@ -830,7 +840,7 @@
     </w:p>
     <w:tbl>
       <w:tblPr>
-        <w:tblStyle w:val="ae"/>
+        <w:tblStyle w:val="TableGrid"/>
         <w:tblW w:w="9945" w:type="dxa"/>
         <w:tblInd w:w="-185" w:type="dxa"/>
         <w:tblLayout w:type="fixed"/>
@@ -1899,7 +1909,7 @@
 </file>
 
 <file path=word/endnotes.xml><?xml version="1.0" encoding="utf-8"?>
-<w:endnotes xmlns:wpc="http://schemas.microsoft.com/office/word/2010/wordprocessingCanvas" xmlns:cx="http://schemas.microsoft.com/office/drawing/2014/chartex" xmlns:cx1="http://schemas.microsoft.com/office/drawing/2015/9/8/chartex" xmlns:cx2="http://schemas.microsoft.com/office/drawing/2015/10/21/chartex" xmlns:cx3="http://schemas.microsoft.com/office/drawing/2016/5/9/chartex" xmlns:cx4="http://schemas.microsoft.com/office/drawing/2016/5/10/chartex" xmlns:cx5="http://schemas.microsoft.com/office/drawing/2016/5/11/chartex" xmlns:cx6="http://schemas.microsoft.com/office/drawing/2016/5/12/chartex" xmlns:cx7="http://schemas.microsoft.com/office/drawing/2016/5/13/chartex" xmlns:cx8="http://schemas.microsoft.com/office/drawing/2016/5/14/chartex" xmlns:mc="http://schemas.openxmlformats.org/markup-compatibility/2006" xmlns:aink="http://schemas.microsoft.com/office/drawing/2016/ink" xmlns:am3d="http://schemas.microsoft.com/office/drawing/2017/model3d" xmlns:o="urn:schemas-microsoft-com:office:office" xmlns:oel="http://schemas.microsoft.com/office/2019/extlst" xmlns:r="http://schemas.openxmlformats.org/officeDocument/2006/relationships" xmlns:m="http://schemas.openxmlformats.org/officeDocument/2006/math" xmlns:v="urn:schemas-microsoft-com:vml" xmlns:wp14="http://schemas.microsoft.com/office/word/2010/wordprocessingDrawing" xmlns:wp="http://schemas.openxmlformats.org/drawingml/2006/wordprocessingDrawing" xmlns:w10="urn:schemas-microsoft-com:office:word" xmlns:w="http://schemas.openxmlformats.org/wordprocessingml/2006/main" xmlns:w14="http://schemas.microsoft.com/office/word/2010/wordml" xmlns:w15="http://schemas.microsoft.com/office/word/2012/wordml" xmlns:w16cex="http://schemas.microsoft.com/office/word/2018/wordml/cex" xmlns:w16cid="http://schemas.microsoft.com/office/word/2016/wordml/cid" xmlns:w16="http://schemas.microsoft.com/office/word/2018/wordml" xmlns:w16du="http://schemas.microsoft.com/office/word/2023/wordml/word16du" xmlns:w16sdtdh="http://schemas.microsoft.com/office/word/2020/wordml/sdtdatahash" xmlns:w16sdtfl="http://schemas.microsoft.com/office/word/2024/wordml/sdtformatlock" xmlns:w16se="http://schemas.microsoft.com/office/word/2015/wordml/symex" xmlns:wpg="http://schemas.microsoft.com/office/word/2010/wordprocessingGroup" xmlns:wpi="http://schemas.microsoft.com/office/word/2010/wordprocessingInk" xmlns:wne="http://schemas.microsoft.com/office/word/2006/wordml" xmlns:wps="http://schemas.microsoft.com/office/word/2010/wordprocessingShape" mc:Ignorable="w14 w15 w16se w16cid w16 w16cex w16sdtdh w16sdtfl w16du wp14">
+<w:endnotes xmlns:wpc="http://schemas.microsoft.com/office/word/2010/wordprocessingCanvas" xmlns:cx="http://schemas.microsoft.com/office/drawing/2014/chartex" xmlns:cx1="http://schemas.microsoft.com/office/drawing/2015/9/8/chartex" xmlns:cx2="http://schemas.microsoft.com/office/drawing/2015/10/21/chartex" xmlns:cx3="http://schemas.microsoft.com/office/drawing/2016/5/9/chartex" xmlns:cx4="http://schemas.microsoft.com/office/drawing/2016/5/10/chartex" xmlns:cx5="http://schemas.microsoft.com/office/drawing/2016/5/11/chartex" xmlns:cx6="http://schemas.microsoft.com/office/drawing/2016/5/12/chartex" xmlns:cx7="http://schemas.microsoft.com/office/drawing/2016/5/13/chartex" xmlns:cx8="http://schemas.microsoft.com/office/drawing/2016/5/14/chartex" xmlns:mc="http://schemas.openxmlformats.org/markup-compatibility/2006" xmlns:m="http://schemas.openxmlformats.org/officeDocument/2006/math" xmlns:aink="http://schemas.microsoft.com/office/drawing/2016/ink" xmlns:am3d="http://schemas.microsoft.com/office/drawing/2017/model3d" xmlns:oel="http://schemas.microsoft.com/office/2019/extlst" xmlns:r="http://schemas.openxmlformats.org/officeDocument/2006/relationships" xmlns:wp14="http://schemas.microsoft.com/office/word/2010/wordprocessingDrawing" xmlns:wp="http://schemas.openxmlformats.org/drawingml/2006/wordprocessingDrawing" xmlns:wpg="http://schemas.microsoft.com/office/word/2010/wordprocessingGroup" xmlns:wpi="http://schemas.microsoft.com/office/word/2010/wordprocessingInk" xmlns:wps="http://schemas.microsoft.com/office/word/2010/wordprocessingShape" xmlns:o="urn:schemas-microsoft-com:office:office" xmlns:v="urn:schemas-microsoft-com:vml" xmlns:w10="urn:schemas-microsoft-com:office:word" xmlns:w="http://schemas.openxmlformats.org/wordprocessingml/2006/main" xmlns:w14="http://schemas.microsoft.com/office/word/2010/wordml" xmlns:w15="http://schemas.microsoft.com/office/word/2012/wordml" xmlns:w16cex="http://schemas.microsoft.com/office/word/2018/wordml/cex" xmlns:w16cid="http://schemas.microsoft.com/office/word/2016/wordml/cid" xmlns:w16="http://schemas.microsoft.com/office/word/2018/wordml" xmlns:w16sdtdh="http://schemas.microsoft.com/office/word/2020/wordml/sdtdatahash" xmlns:w16sdtfl="http://schemas.microsoft.com/office/word/2024/wordml/sdtformatlock" xmlns:w16se="http://schemas.microsoft.com/office/word/2015/wordml/symex" xmlns:w16du="http://schemas.microsoft.com/office/word/2023/wordml/word16du" xmlns:wne="http://schemas.microsoft.com/office/word/2006/wordml" mc:Ignorable="w14 w15 w16se w16cid w16 w16cex w16sdtdh w16sdtfl w16du wp14">
   <w:endnote w:type="separator" w:id="-1">
     <w:p>
       <w:r>
@@ -1918,7 +1928,7 @@
 </file>
 
 <file path=word/footnotes.xml><?xml version="1.0" encoding="utf-8"?>
-<w:footnotes xmlns:wpc="http://schemas.microsoft.com/office/word/2010/wordprocessingCanvas" xmlns:cx="http://schemas.microsoft.com/office/drawing/2014/chartex" xmlns:cx1="http://schemas.microsoft.com/office/drawing/2015/9/8/chartex" xmlns:cx2="http://schemas.microsoft.com/office/drawing/2015/10/21/chartex" xmlns:cx3="http://schemas.microsoft.com/office/drawing/2016/5/9/chartex" xmlns:cx4="http://schemas.microsoft.com/office/drawing/2016/5/10/chartex" xmlns:cx5="http://schemas.microsoft.com/office/drawing/2016/5/11/chartex" xmlns:cx6="http://schemas.microsoft.com/office/drawing/2016/5/12/chartex" xmlns:cx7="http://schemas.microsoft.com/office/drawing/2016/5/13/chartex" xmlns:cx8="http://schemas.microsoft.com/office/drawing/2016/5/14/chartex" xmlns:mc="http://schemas.openxmlformats.org/markup-compatibility/2006" xmlns:aink="http://schemas.microsoft.com/office/drawing/2016/ink" xmlns:am3d="http://schemas.microsoft.com/office/drawing/2017/model3d" xmlns:o="urn:schemas-microsoft-com:office:office" xmlns:oel="http://schemas.microsoft.com/office/2019/extlst" xmlns:r="http://schemas.openxmlformats.org/officeDocument/2006/relationships" xmlns:m="http://schemas.openxmlformats.org/officeDocument/2006/math" xmlns:v="urn:schemas-microsoft-com:vml" xmlns:wp14="http://schemas.microsoft.com/office/word/2010/wordprocessingDrawing" xmlns:wp="http://schemas.openxmlformats.org/drawingml/2006/wordprocessingDrawing" xmlns:w10="urn:schemas-microsoft-com:office:word" xmlns:w="http://schemas.openxmlformats.org/wordprocessingml/2006/main" xmlns:w14="http://schemas.microsoft.com/office/word/2010/wordml" xmlns:w15="http://schemas.microsoft.com/office/word/2012/wordml" xmlns:w16cex="http://schemas.microsoft.com/office/word/2018/wordml/cex" xmlns:w16cid="http://schemas.microsoft.com/office/word/2016/wordml/cid" xmlns:w16="http://schemas.microsoft.com/office/word/2018/wordml" xmlns:w16du="http://schemas.microsoft.com/office/word/2023/wordml/word16du" xmlns:w16sdtdh="http://schemas.microsoft.com/office/word/2020/wordml/sdtdatahash" xmlns:w16sdtfl="http://schemas.microsoft.com/office/word/2024/wordml/sdtformatlock" xmlns:w16se="http://schemas.microsoft.com/office/word/2015/wordml/symex" xmlns:wpg="http://schemas.microsoft.com/office/word/2010/wordprocessingGroup" xmlns:wpi="http://schemas.microsoft.com/office/word/2010/wordprocessingInk" xmlns:wne="http://schemas.microsoft.com/office/word/2006/wordml" xmlns:wps="http://schemas.microsoft.com/office/word/2010/wordprocessingShape" mc:Ignorable="w14 w15 w16se w16cid w16 w16cex w16sdtdh w16sdtfl w16du wp14">
+<w:footnotes xmlns:wpc="http://schemas.microsoft.com/office/word/2010/wordprocessingCanvas" xmlns:cx="http://schemas.microsoft.com/office/drawing/2014/chartex" xmlns:cx1="http://schemas.microsoft.com/office/drawing/2015/9/8/chartex" xmlns:cx2="http://schemas.microsoft.com/office/drawing/2015/10/21/chartex" xmlns:cx3="http://schemas.microsoft.com/office/drawing/2016/5/9/chartex" xmlns:cx4="http://schemas.microsoft.com/office/drawing/2016/5/10/chartex" xmlns:cx5="http://schemas.microsoft.com/office/drawing/2016/5/11/chartex" xmlns:cx6="http://schemas.microsoft.com/office/drawing/2016/5/12/chartex" xmlns:cx7="http://schemas.microsoft.com/office/drawing/2016/5/13/chartex" xmlns:cx8="http://schemas.microsoft.com/office/drawing/2016/5/14/chartex" xmlns:mc="http://schemas.openxmlformats.org/markup-compatibility/2006" xmlns:m="http://schemas.openxmlformats.org/officeDocument/2006/math" xmlns:aink="http://schemas.microsoft.com/office/drawing/2016/ink" xmlns:am3d="http://schemas.microsoft.com/office/drawing/2017/model3d" xmlns:oel="http://schemas.microsoft.com/office/2019/extlst" xmlns:r="http://schemas.openxmlformats.org/officeDocument/2006/relationships" xmlns:wp14="http://schemas.microsoft.com/office/word/2010/wordprocessingDrawing" xmlns:wp="http://schemas.openxmlformats.org/drawingml/2006/wordprocessingDrawing" xmlns:wpg="http://schemas.microsoft.com/office/word/2010/wordprocessingGroup" xmlns:wpi="http://schemas.microsoft.com/office/word/2010/wordprocessingInk" xmlns:wps="http://schemas.microsoft.com/office/word/2010/wordprocessingShape" xmlns:o="urn:schemas-microsoft-com:office:office" xmlns:v="urn:schemas-microsoft-com:vml" xmlns:w10="urn:schemas-microsoft-com:office:word" xmlns:w="http://schemas.openxmlformats.org/wordprocessingml/2006/main" xmlns:w14="http://schemas.microsoft.com/office/word/2010/wordml" xmlns:w15="http://schemas.microsoft.com/office/word/2012/wordml" xmlns:w16cex="http://schemas.microsoft.com/office/word/2018/wordml/cex" xmlns:w16cid="http://schemas.microsoft.com/office/word/2016/wordml/cid" xmlns:w16="http://schemas.microsoft.com/office/word/2018/wordml" xmlns:w16sdtdh="http://schemas.microsoft.com/office/word/2020/wordml/sdtdatahash" xmlns:w16sdtfl="http://schemas.microsoft.com/office/word/2024/wordml/sdtformatlock" xmlns:w16se="http://schemas.microsoft.com/office/word/2015/wordml/symex" xmlns:w16du="http://schemas.microsoft.com/office/word/2023/wordml/word16du" xmlns:wne="http://schemas.microsoft.com/office/word/2006/wordml" mc:Ignorable="w14 w15 w16se w16cid w16 w16cex w16sdtdh w16sdtfl w16du wp14">
   <w:footnote w:type="separator" w:id="-1">
     <w:p>
       <w:r>
@@ -1937,7 +1947,7 @@
 </file>
 
 <file path=word/styles.xml><?xml version="1.0" encoding="utf-8"?>
-<w:styles xmlns:mc="http://schemas.openxmlformats.org/markup-compatibility/2006" xmlns:r="http://schemas.openxmlformats.org/officeDocument/2006/relationships" xmlns:w="http://schemas.openxmlformats.org/wordprocessingml/2006/main" xmlns:w14="http://schemas.microsoft.com/office/word/2010/wordml" xmlns:w15="http://schemas.microsoft.com/office/word/2012/wordml" xmlns:w16cex="http://schemas.microsoft.com/office/word/2018/wordml/cex" xmlns:w16cid="http://schemas.microsoft.com/office/word/2016/wordml/cid" xmlns:w16="http://schemas.microsoft.com/office/word/2018/wordml" xmlns:w16du="http://schemas.microsoft.com/office/word/2023/wordml/word16du" xmlns:w16sdtdh="http://schemas.microsoft.com/office/word/2020/wordml/sdtdatahash" xmlns:w16sdtfl="http://schemas.microsoft.com/office/word/2024/wordml/sdtformatlock" xmlns:w16se="http://schemas.microsoft.com/office/word/2015/wordml/symex" mc:Ignorable="w14 w15 w16se w16cid w16 w16cex w16sdtdh w16sdtfl w16du">
+<w:styles xmlns:mc="http://schemas.openxmlformats.org/markup-compatibility/2006" xmlns:r="http://schemas.openxmlformats.org/officeDocument/2006/relationships" xmlns:w="http://schemas.openxmlformats.org/wordprocessingml/2006/main" xmlns:w14="http://schemas.microsoft.com/office/word/2010/wordml" xmlns:w15="http://schemas.microsoft.com/office/word/2012/wordml" xmlns:w16cex="http://schemas.microsoft.com/office/word/2018/wordml/cex" xmlns:w16cid="http://schemas.microsoft.com/office/word/2016/wordml/cid" xmlns:w16="http://schemas.microsoft.com/office/word/2018/wordml" xmlns:w16sdtdh="http://schemas.microsoft.com/office/word/2020/wordml/sdtdatahash" xmlns:w16sdtfl="http://schemas.microsoft.com/office/word/2024/wordml/sdtformatlock" xmlns:w16se="http://schemas.microsoft.com/office/word/2015/wordml/symex" xmlns:w16du="http://schemas.microsoft.com/office/word/2023/wordml/word16du" mc:Ignorable="w14 w15 w16se w16cid w16 w16cex w16sdtdh w16sdtfl w16du">
   <w:docDefaults>
     <w:rPrDefault>
       <w:rPr>
@@ -2333,7 +2343,7 @@
     <w:lsdException w:name="Unresolved Mention" w:semiHidden="1" w:unhideWhenUsed="1"/>
     <w:lsdException w:name="Smart Link" w:semiHidden="1" w:unhideWhenUsed="1"/>
   </w:latentStyles>
-  <w:style w:type="paragraph" w:default="1" w:styleId="a">
+  <w:style w:type="paragraph" w:default="1" w:styleId="Normal">
     <w:name w:val="Normal"/>
     <w:qFormat/>
     <w:rsid w:val="00824612"/>
@@ -2349,11 +2359,11 @@
       <w14:ligatures w14:val="none"/>
     </w:rPr>
   </w:style>
-  <w:style w:type="paragraph" w:styleId="1">
+  <w:style w:type="paragraph" w:styleId="Heading1">
     <w:name w:val="heading 1"/>
-    <w:basedOn w:val="a"/>
-    <w:next w:val="a"/>
-    <w:link w:val="10"/>
+    <w:basedOn w:val="Normal"/>
+    <w:next w:val="Normal"/>
+    <w:link w:val="Heading1Char"/>
     <w:uiPriority w:val="9"/>
     <w:qFormat/>
     <w:rsid w:val="00824612"/>
@@ -2373,11 +2383,11 @@
       <w14:ligatures w14:val="standardContextual"/>
     </w:rPr>
   </w:style>
-  <w:style w:type="paragraph" w:styleId="2">
+  <w:style w:type="paragraph" w:styleId="Heading2">
     <w:name w:val="heading 2"/>
-    <w:basedOn w:val="a"/>
-    <w:next w:val="a"/>
-    <w:link w:val="20"/>
+    <w:basedOn w:val="Normal"/>
+    <w:next w:val="Normal"/>
+    <w:link w:val="Heading2Char"/>
     <w:uiPriority w:val="9"/>
     <w:semiHidden/>
     <w:unhideWhenUsed/>
@@ -2399,11 +2409,11 @@
       <w14:ligatures w14:val="standardContextual"/>
     </w:rPr>
   </w:style>
-  <w:style w:type="paragraph" w:styleId="3">
+  <w:style w:type="paragraph" w:styleId="Heading3">
     <w:name w:val="heading 3"/>
-    <w:basedOn w:val="a"/>
-    <w:next w:val="a"/>
-    <w:link w:val="30"/>
+    <w:basedOn w:val="Normal"/>
+    <w:next w:val="Normal"/>
+    <w:link w:val="Heading3Char"/>
     <w:uiPriority w:val="9"/>
     <w:semiHidden/>
     <w:unhideWhenUsed/>
@@ -2425,11 +2435,11 @@
       <w14:ligatures w14:val="standardContextual"/>
     </w:rPr>
   </w:style>
-  <w:style w:type="paragraph" w:styleId="4">
+  <w:style w:type="paragraph" w:styleId="Heading4">
     <w:name w:val="heading 4"/>
-    <w:basedOn w:val="a"/>
-    <w:next w:val="a"/>
-    <w:link w:val="40"/>
+    <w:basedOn w:val="Normal"/>
+    <w:next w:val="Normal"/>
+    <w:link w:val="Heading4Char"/>
     <w:uiPriority w:val="9"/>
     <w:semiHidden/>
     <w:unhideWhenUsed/>
@@ -2453,11 +2463,11 @@
       <w14:ligatures w14:val="standardContextual"/>
     </w:rPr>
   </w:style>
-  <w:style w:type="paragraph" w:styleId="5">
+  <w:style w:type="paragraph" w:styleId="Heading5">
     <w:name w:val="heading 5"/>
-    <w:basedOn w:val="a"/>
-    <w:next w:val="a"/>
-    <w:link w:val="50"/>
+    <w:basedOn w:val="Normal"/>
+    <w:next w:val="Normal"/>
+    <w:link w:val="Heading5Char"/>
     <w:uiPriority w:val="9"/>
     <w:semiHidden/>
     <w:unhideWhenUsed/>
@@ -2479,11 +2489,11 @@
       <w14:ligatures w14:val="standardContextual"/>
     </w:rPr>
   </w:style>
-  <w:style w:type="paragraph" w:styleId="6">
+  <w:style w:type="paragraph" w:styleId="Heading6">
     <w:name w:val="heading 6"/>
-    <w:basedOn w:val="a"/>
-    <w:next w:val="a"/>
-    <w:link w:val="60"/>
+    <w:basedOn w:val="Normal"/>
+    <w:next w:val="Normal"/>
+    <w:link w:val="Heading6Char"/>
     <w:uiPriority w:val="9"/>
     <w:semiHidden/>
     <w:unhideWhenUsed/>
@@ -2507,11 +2517,11 @@
       <w14:ligatures w14:val="standardContextual"/>
     </w:rPr>
   </w:style>
-  <w:style w:type="paragraph" w:styleId="7">
+  <w:style w:type="paragraph" w:styleId="Heading7">
     <w:name w:val="heading 7"/>
-    <w:basedOn w:val="a"/>
-    <w:next w:val="a"/>
-    <w:link w:val="70"/>
+    <w:basedOn w:val="Normal"/>
+    <w:next w:val="Normal"/>
+    <w:link w:val="Heading7Char"/>
     <w:uiPriority w:val="9"/>
     <w:semiHidden/>
     <w:unhideWhenUsed/>
@@ -2533,11 +2543,11 @@
       <w14:ligatures w14:val="standardContextual"/>
     </w:rPr>
   </w:style>
-  <w:style w:type="paragraph" w:styleId="8">
+  <w:style w:type="paragraph" w:styleId="Heading8">
     <w:name w:val="heading 8"/>
-    <w:basedOn w:val="a"/>
-    <w:next w:val="a"/>
-    <w:link w:val="80"/>
+    <w:basedOn w:val="Normal"/>
+    <w:next w:val="Normal"/>
+    <w:link w:val="Heading8Char"/>
     <w:uiPriority w:val="9"/>
     <w:semiHidden/>
     <w:unhideWhenUsed/>
@@ -2561,11 +2571,11 @@
       <w14:ligatures w14:val="standardContextual"/>
     </w:rPr>
   </w:style>
-  <w:style w:type="paragraph" w:styleId="9">
+  <w:style w:type="paragraph" w:styleId="Heading9">
     <w:name w:val="heading 9"/>
-    <w:basedOn w:val="a"/>
-    <w:next w:val="a"/>
-    <w:link w:val="90"/>
+    <w:basedOn w:val="Normal"/>
+    <w:next w:val="Normal"/>
+    <w:link w:val="Heading9Char"/>
     <w:uiPriority w:val="9"/>
     <w:semiHidden/>
     <w:unhideWhenUsed/>
@@ -2587,13 +2597,13 @@
       <w14:ligatures w14:val="standardContextual"/>
     </w:rPr>
   </w:style>
-  <w:style w:type="character" w:default="1" w:styleId="a0">
+  <w:style w:type="character" w:default="1" w:styleId="DefaultParagraphFont">
     <w:name w:val="Default Paragraph Font"/>
     <w:uiPriority w:val="1"/>
     <w:semiHidden/>
     <w:unhideWhenUsed/>
   </w:style>
-  <w:style w:type="table" w:default="1" w:styleId="a1">
+  <w:style w:type="table" w:default="1" w:styleId="TableNormal">
     <w:name w:val="Normal Table"/>
     <w:uiPriority w:val="99"/>
     <w:semiHidden/>
@@ -2608,16 +2618,16 @@
       </w:tblCellMar>
     </w:tblPr>
   </w:style>
-  <w:style w:type="numbering" w:default="1" w:styleId="a2">
+  <w:style w:type="numbering" w:default="1" w:styleId="NoList">
     <w:name w:val="No List"/>
     <w:uiPriority w:val="99"/>
     <w:semiHidden/>
     <w:unhideWhenUsed/>
   </w:style>
-  <w:style w:type="character" w:customStyle="1" w:styleId="10">
-    <w:name w:val="หัวเรื่อง 1 อักขระ"/>
-    <w:basedOn w:val="a0"/>
-    <w:link w:val="1"/>
+  <w:style w:type="character" w:customStyle="1" w:styleId="Heading1Char">
+    <w:name w:val="Heading 1 Char"/>
+    <w:basedOn w:val="DefaultParagraphFont"/>
+    <w:link w:val="Heading1"/>
     <w:uiPriority w:val="9"/>
     <w:rsid w:val="00824612"/>
     <w:rPr>
@@ -2627,10 +2637,10 @@
       <w:szCs w:val="50"/>
     </w:rPr>
   </w:style>
-  <w:style w:type="character" w:customStyle="1" w:styleId="20">
-    <w:name w:val="หัวเรื่อง 2 อักขระ"/>
-    <w:basedOn w:val="a0"/>
-    <w:link w:val="2"/>
+  <w:style w:type="character" w:customStyle="1" w:styleId="Heading2Char">
+    <w:name w:val="Heading 2 Char"/>
+    <w:basedOn w:val="DefaultParagraphFont"/>
+    <w:link w:val="Heading2"/>
     <w:uiPriority w:val="9"/>
     <w:semiHidden/>
     <w:rsid w:val="00824612"/>
@@ -2641,10 +2651,10 @@
       <w:szCs w:val="40"/>
     </w:rPr>
   </w:style>
-  <w:style w:type="character" w:customStyle="1" w:styleId="30">
-    <w:name w:val="หัวเรื่อง 3 อักขระ"/>
-    <w:basedOn w:val="a0"/>
-    <w:link w:val="3"/>
+  <w:style w:type="character" w:customStyle="1" w:styleId="Heading3Char">
+    <w:name w:val="Heading 3 Char"/>
+    <w:basedOn w:val="DefaultParagraphFont"/>
+    <w:link w:val="Heading3"/>
     <w:uiPriority w:val="9"/>
     <w:semiHidden/>
     <w:rsid w:val="00824612"/>
@@ -2655,10 +2665,10 @@
       <w:szCs w:val="35"/>
     </w:rPr>
   </w:style>
-  <w:style w:type="character" w:customStyle="1" w:styleId="40">
-    <w:name w:val="หัวเรื่อง 4 อักขระ"/>
-    <w:basedOn w:val="a0"/>
-    <w:link w:val="4"/>
+  <w:style w:type="character" w:customStyle="1" w:styleId="Heading4Char">
+    <w:name w:val="Heading 4 Char"/>
+    <w:basedOn w:val="DefaultParagraphFont"/>
+    <w:link w:val="Heading4"/>
     <w:uiPriority w:val="9"/>
     <w:semiHidden/>
     <w:rsid w:val="00824612"/>
@@ -2669,10 +2679,10 @@
       <w:color w:val="2F5496" w:themeColor="accent1" w:themeShade="BF"/>
     </w:rPr>
   </w:style>
-  <w:style w:type="character" w:customStyle="1" w:styleId="50">
-    <w:name w:val="หัวเรื่อง 5 อักขระ"/>
-    <w:basedOn w:val="a0"/>
-    <w:link w:val="5"/>
+  <w:style w:type="character" w:customStyle="1" w:styleId="Heading5Char">
+    <w:name w:val="Heading 5 Char"/>
+    <w:basedOn w:val="DefaultParagraphFont"/>
+    <w:link w:val="Heading5"/>
     <w:uiPriority w:val="9"/>
     <w:semiHidden/>
     <w:rsid w:val="00824612"/>
@@ -2681,10 +2691,10 @@
       <w:color w:val="2F5496" w:themeColor="accent1" w:themeShade="BF"/>
     </w:rPr>
   </w:style>
-  <w:style w:type="character" w:customStyle="1" w:styleId="60">
-    <w:name w:val="หัวเรื่อง 6 อักขระ"/>
-    <w:basedOn w:val="a0"/>
-    <w:link w:val="6"/>
+  <w:style w:type="character" w:customStyle="1" w:styleId="Heading6Char">
+    <w:name w:val="Heading 6 Char"/>
+    <w:basedOn w:val="DefaultParagraphFont"/>
+    <w:link w:val="Heading6"/>
     <w:uiPriority w:val="9"/>
     <w:semiHidden/>
     <w:rsid w:val="00824612"/>
@@ -2695,10 +2705,10 @@
       <w:color w:val="595959" w:themeColor="text1" w:themeTint="A6"/>
     </w:rPr>
   </w:style>
-  <w:style w:type="character" w:customStyle="1" w:styleId="70">
-    <w:name w:val="หัวเรื่อง 7 อักขระ"/>
-    <w:basedOn w:val="a0"/>
-    <w:link w:val="7"/>
+  <w:style w:type="character" w:customStyle="1" w:styleId="Heading7Char">
+    <w:name w:val="Heading 7 Char"/>
+    <w:basedOn w:val="DefaultParagraphFont"/>
+    <w:link w:val="Heading7"/>
     <w:uiPriority w:val="9"/>
     <w:semiHidden/>
     <w:rsid w:val="00824612"/>
@@ -2707,10 +2717,10 @@
       <w:color w:val="595959" w:themeColor="text1" w:themeTint="A6"/>
     </w:rPr>
   </w:style>
-  <w:style w:type="character" w:customStyle="1" w:styleId="80">
-    <w:name w:val="หัวเรื่อง 8 อักขระ"/>
-    <w:basedOn w:val="a0"/>
-    <w:link w:val="8"/>
+  <w:style w:type="character" w:customStyle="1" w:styleId="Heading8Char">
+    <w:name w:val="Heading 8 Char"/>
+    <w:basedOn w:val="DefaultParagraphFont"/>
+    <w:link w:val="Heading8"/>
     <w:uiPriority w:val="9"/>
     <w:semiHidden/>
     <w:rsid w:val="00824612"/>
@@ -2721,10 +2731,10 @@
       <w:color w:val="272727" w:themeColor="text1" w:themeTint="D8"/>
     </w:rPr>
   </w:style>
-  <w:style w:type="character" w:customStyle="1" w:styleId="90">
-    <w:name w:val="หัวเรื่อง 9 อักขระ"/>
-    <w:basedOn w:val="a0"/>
-    <w:link w:val="9"/>
+  <w:style w:type="character" w:customStyle="1" w:styleId="Heading9Char">
+    <w:name w:val="Heading 9 Char"/>
+    <w:basedOn w:val="DefaultParagraphFont"/>
+    <w:link w:val="Heading9"/>
     <w:uiPriority w:val="9"/>
     <w:semiHidden/>
     <w:rsid w:val="00824612"/>
@@ -2733,11 +2743,11 @@
       <w:color w:val="272727" w:themeColor="text1" w:themeTint="D8"/>
     </w:rPr>
   </w:style>
-  <w:style w:type="paragraph" w:styleId="a3">
+  <w:style w:type="paragraph" w:styleId="Title">
     <w:name w:val="Title"/>
-    <w:basedOn w:val="a"/>
-    <w:next w:val="a"/>
-    <w:link w:val="a4"/>
+    <w:basedOn w:val="Normal"/>
+    <w:next w:val="Normal"/>
+    <w:link w:val="TitleChar"/>
     <w:uiPriority w:val="10"/>
     <w:qFormat/>
     <w:rsid w:val="00824612"/>
@@ -2755,10 +2765,10 @@
       <w14:ligatures w14:val="standardContextual"/>
     </w:rPr>
   </w:style>
-  <w:style w:type="character" w:customStyle="1" w:styleId="a4">
-    <w:name w:val="ชื่อเรื่อง อักขระ"/>
-    <w:basedOn w:val="a0"/>
-    <w:link w:val="a3"/>
+  <w:style w:type="character" w:customStyle="1" w:styleId="TitleChar">
+    <w:name w:val="Title Char"/>
+    <w:basedOn w:val="DefaultParagraphFont"/>
+    <w:link w:val="Title"/>
     <w:uiPriority w:val="10"/>
     <w:rsid w:val="00824612"/>
     <w:rPr>
@@ -2769,11 +2779,11 @@
       <w:szCs w:val="71"/>
     </w:rPr>
   </w:style>
-  <w:style w:type="paragraph" w:styleId="a5">
+  <w:style w:type="paragraph" w:styleId="Subtitle">
     <w:name w:val="Subtitle"/>
-    <w:basedOn w:val="a"/>
-    <w:next w:val="a"/>
-    <w:link w:val="a6"/>
+    <w:basedOn w:val="Normal"/>
+    <w:next w:val="Normal"/>
+    <w:link w:val="SubtitleChar"/>
     <w:uiPriority w:val="11"/>
     <w:qFormat/>
     <w:rsid w:val="00824612"/>
@@ -2794,10 +2804,10 @@
       <w14:ligatures w14:val="standardContextual"/>
     </w:rPr>
   </w:style>
-  <w:style w:type="character" w:customStyle="1" w:styleId="a6">
-    <w:name w:val="ชื่อเรื่องรอง อักขระ"/>
-    <w:basedOn w:val="a0"/>
-    <w:link w:val="a5"/>
+  <w:style w:type="character" w:customStyle="1" w:styleId="SubtitleChar">
+    <w:name w:val="Subtitle Char"/>
+    <w:basedOn w:val="DefaultParagraphFont"/>
+    <w:link w:val="Subtitle"/>
     <w:uiPriority w:val="11"/>
     <w:rsid w:val="00824612"/>
     <w:rPr>
@@ -2808,11 +2818,11 @@
       <w:szCs w:val="35"/>
     </w:rPr>
   </w:style>
-  <w:style w:type="paragraph" w:styleId="a7">
+  <w:style w:type="paragraph" w:styleId="Quote">
     <w:name w:val="Quote"/>
-    <w:basedOn w:val="a"/>
-    <w:next w:val="a"/>
-    <w:link w:val="a8"/>
+    <w:basedOn w:val="Normal"/>
+    <w:next w:val="Normal"/>
+    <w:link w:val="QuoteChar"/>
     <w:uiPriority w:val="29"/>
     <w:qFormat/>
     <w:rsid w:val="00824612"/>
@@ -2832,10 +2842,10 @@
       <w14:ligatures w14:val="standardContextual"/>
     </w:rPr>
   </w:style>
-  <w:style w:type="character" w:customStyle="1" w:styleId="a8">
-    <w:name w:val="คำอ้างอิง อักขระ"/>
-    <w:basedOn w:val="a0"/>
-    <w:link w:val="a7"/>
+  <w:style w:type="character" w:customStyle="1" w:styleId="QuoteChar">
+    <w:name w:val="Quote Char"/>
+    <w:basedOn w:val="DefaultParagraphFont"/>
+    <w:link w:val="Quote"/>
     <w:uiPriority w:val="29"/>
     <w:rsid w:val="00824612"/>
     <w:rPr>
@@ -2844,9 +2854,9 @@
       <w:color w:val="404040" w:themeColor="text1" w:themeTint="BF"/>
     </w:rPr>
   </w:style>
-  <w:style w:type="paragraph" w:styleId="a9">
+  <w:style w:type="paragraph" w:styleId="ListParagraph">
     <w:name w:val="List Paragraph"/>
-    <w:basedOn w:val="a"/>
+    <w:basedOn w:val="Normal"/>
     <w:uiPriority w:val="34"/>
     <w:qFormat/>
     <w:rsid w:val="00824612"/>
@@ -2864,9 +2874,9 @@
       <w14:ligatures w14:val="standardContextual"/>
     </w:rPr>
   </w:style>
-  <w:style w:type="character" w:styleId="aa">
+  <w:style w:type="character" w:styleId="IntenseEmphasis">
     <w:name w:val="Intense Emphasis"/>
-    <w:basedOn w:val="a0"/>
+    <w:basedOn w:val="DefaultParagraphFont"/>
     <w:uiPriority w:val="21"/>
     <w:qFormat/>
     <w:rsid w:val="00824612"/>
@@ -2876,11 +2886,11 @@
       <w:color w:val="2F5496" w:themeColor="accent1" w:themeShade="BF"/>
     </w:rPr>
   </w:style>
-  <w:style w:type="paragraph" w:styleId="ab">
+  <w:style w:type="paragraph" w:styleId="IntenseQuote">
     <w:name w:val="Intense Quote"/>
-    <w:basedOn w:val="a"/>
-    <w:next w:val="a"/>
-    <w:link w:val="ac"/>
+    <w:basedOn w:val="Normal"/>
+    <w:next w:val="Normal"/>
+    <w:link w:val="IntenseQuoteChar"/>
     <w:uiPriority w:val="30"/>
     <w:qFormat/>
     <w:rsid w:val="00824612"/>
@@ -2905,10 +2915,10 @@
       <w14:ligatures w14:val="standardContextual"/>
     </w:rPr>
   </w:style>
-  <w:style w:type="character" w:customStyle="1" w:styleId="ac">
-    <w:name w:val="ทำให้คำอ้างอิงเป็นสีเข้มขึ้น อักขระ"/>
-    <w:basedOn w:val="a0"/>
-    <w:link w:val="ab"/>
+  <w:style w:type="character" w:customStyle="1" w:styleId="IntenseQuoteChar">
+    <w:name w:val="Intense Quote Char"/>
+    <w:basedOn w:val="DefaultParagraphFont"/>
+    <w:link w:val="IntenseQuote"/>
     <w:uiPriority w:val="30"/>
     <w:rsid w:val="00824612"/>
     <w:rPr>
@@ -2917,9 +2927,9 @@
       <w:color w:val="2F5496" w:themeColor="accent1" w:themeShade="BF"/>
     </w:rPr>
   </w:style>
-  <w:style w:type="character" w:styleId="ad">
+  <w:style w:type="character" w:styleId="IntenseReference">
     <w:name w:val="Intense Reference"/>
-    <w:basedOn w:val="a0"/>
+    <w:basedOn w:val="DefaultParagraphFont"/>
     <w:uiPriority w:val="32"/>
     <w:qFormat/>
     <w:rsid w:val="00824612"/>
@@ -2931,9 +2941,9 @@
       <w:spacing w:val="5"/>
     </w:rPr>
   </w:style>
-  <w:style w:type="table" w:styleId="ae">
+  <w:style w:type="table" w:styleId="TableGrid">
     <w:name w:val="Table Grid"/>
-    <w:basedOn w:val="a1"/>
+    <w:basedOn w:val="TableNormal"/>
     <w:uiPriority w:val="39"/>
     <w:rsid w:val="00824612"/>
     <w:pPr>
@@ -2957,10 +2967,10 @@
       </w:tblBorders>
     </w:tblPr>
   </w:style>
-  <w:style w:type="paragraph" w:styleId="af">
+  <w:style w:type="paragraph" w:styleId="Header">
     <w:name w:val="header"/>
-    <w:basedOn w:val="a"/>
-    <w:link w:val="af0"/>
+    <w:basedOn w:val="Normal"/>
+    <w:link w:val="HeaderChar"/>
     <w:uiPriority w:val="99"/>
     <w:unhideWhenUsed/>
     <w:rsid w:val="00824612"/>
@@ -2975,10 +2985,10 @@
       <w:szCs w:val="30"/>
     </w:rPr>
   </w:style>
-  <w:style w:type="character" w:customStyle="1" w:styleId="af0">
-    <w:name w:val="หัวกระดาษ อักขระ"/>
-    <w:basedOn w:val="a0"/>
-    <w:link w:val="af"/>
+  <w:style w:type="character" w:customStyle="1" w:styleId="HeaderChar">
+    <w:name w:val="Header Char"/>
+    <w:basedOn w:val="DefaultParagraphFont"/>
+    <w:link w:val="Header"/>
     <w:uiPriority w:val="99"/>
     <w:rsid w:val="00824612"/>
     <w:rPr>
@@ -2990,10 +3000,10 @@
       <w14:ligatures w14:val="none"/>
     </w:rPr>
   </w:style>
-  <w:style w:type="paragraph" w:styleId="af1">
+  <w:style w:type="paragraph" w:styleId="Footer">
     <w:name w:val="footer"/>
-    <w:basedOn w:val="a"/>
-    <w:link w:val="af2"/>
+    <w:basedOn w:val="Normal"/>
+    <w:link w:val="FooterChar"/>
     <w:uiPriority w:val="99"/>
     <w:unhideWhenUsed/>
     <w:rsid w:val="00824612"/>
@@ -3008,10 +3018,10 @@
       <w:szCs w:val="30"/>
     </w:rPr>
   </w:style>
-  <w:style w:type="character" w:customStyle="1" w:styleId="af2">
-    <w:name w:val="ท้ายกระดาษ อักขระ"/>
-    <w:basedOn w:val="a0"/>
-    <w:link w:val="af1"/>
+  <w:style w:type="character" w:customStyle="1" w:styleId="FooterChar">
+    <w:name w:val="Footer Char"/>
+    <w:basedOn w:val="DefaultParagraphFont"/>
+    <w:link w:val="Footer"/>
     <w:uiPriority w:val="99"/>
     <w:rsid w:val="00824612"/>
     <w:rPr>

</xml_diff>